<commit_message>
updated the HTTP verbs in rest api basics
</commit_message>
<xml_diff>
--- a/f18_rest_api_basics_flutter.docx
+++ b/f18_rest_api_basics_flutter.docx
@@ -2860,23 +2860,28 @@
       <w:pPr>
         <w:jc w:val="both"/>
         <w:rPr>
-          <w:b/>
-          <w:bCs/>
-          <w:sz w:val="36"/>
-          <w:szCs w:val="36"/>
-        </w:rPr>
-      </w:pPr>
+          <w:sz w:val="36"/>
+          <w:szCs w:val="36"/>
+        </w:rPr>
+      </w:pPr>
+      <w:r>
+        <w:rPr>
+          <w:sz w:val="36"/>
+          <w:szCs w:val="36"/>
+        </w:rPr>
+        <w:t># There are 9 HTTP verbs:</w:t>
+      </w:r>
     </w:p>
     <w:tbl>
       <w:tblPr>
         <w:tblStyle w:val="GridTable4-Accent1"/>
-        <w:tblW w:w="0" w:type="auto"/>
+        <w:tblW w:w="9175" w:type="dxa"/>
         <w:tblLook w:val="04A0" w:firstRow="1" w:lastRow="0" w:firstColumn="1" w:lastColumn="0" w:noHBand="0" w:noVBand="1"/>
       </w:tblPr>
       <w:tblGrid>
-        <w:gridCol w:w="1466"/>
-        <w:gridCol w:w="3378"/>
-        <w:gridCol w:w="2578"/>
+        <w:gridCol w:w="1725"/>
+        <w:gridCol w:w="3119"/>
+        <w:gridCol w:w="4331"/>
       </w:tblGrid>
       <w:tr>
         <w:trPr>
@@ -2932,7 +2937,7 @@
         </w:tc>
         <w:tc>
           <w:tcPr>
-            <w:tcW w:w="0" w:type="auto"/>
+            <w:tcW w:w="4331" w:type="dxa"/>
             <w:hideMark/>
           </w:tcPr>
           <w:p>
@@ -3005,11 +3010,18 @@
               </w:rPr>
               <w:t>Retrieve data</w:t>
             </w:r>
+            <w:r>
+              <w:rPr>
+                <w:sz w:val="36"/>
+                <w:szCs w:val="36"/>
+              </w:rPr>
+              <w:t xml:space="preserve"> (Read)</w:t>
+            </w:r>
           </w:p>
         </w:tc>
         <w:tc>
           <w:tcPr>
-            <w:tcW w:w="0" w:type="auto"/>
+            <w:tcW w:w="4331" w:type="dxa"/>
             <w:hideMark/>
           </w:tcPr>
           <w:p>
@@ -3028,6 +3040,20 @@
                 <w:szCs w:val="36"/>
               </w:rPr>
               <w:t>Fetch all posts</w:t>
+            </w:r>
+            <w:r>
+              <w:rPr>
+                <w:sz w:val="36"/>
+                <w:szCs w:val="36"/>
+              </w:rPr>
+              <w:t>. It’s</w:t>
+            </w:r>
+            <w:r>
+              <w:rPr>
+                <w:sz w:val="36"/>
+                <w:szCs w:val="36"/>
+              </w:rPr>
+              <w:t xml:space="preserve"> read only and doesn’t change anything</w:t>
             </w:r>
           </w:p>
         </w:tc>
@@ -3083,7 +3109,7 @@
         </w:tc>
         <w:tc>
           <w:tcPr>
-            <w:tcW w:w="0" w:type="auto"/>
+            <w:tcW w:w="4331" w:type="dxa"/>
             <w:hideMark/>
           </w:tcPr>
           <w:p>
@@ -3102,6 +3128,44 @@
                 <w:szCs w:val="36"/>
               </w:rPr>
               <w:t>Add a new post</w:t>
+            </w:r>
+            <w:r>
+              <w:rPr>
+                <w:sz w:val="36"/>
+                <w:szCs w:val="36"/>
+              </w:rPr>
+              <w:t xml:space="preserve">. </w:t>
+            </w:r>
+            <w:r>
+              <w:rPr>
+                <w:sz w:val="36"/>
+                <w:szCs w:val="36"/>
+              </w:rPr>
+              <w:t xml:space="preserve">But it’s not idempotent if we send the same </w:t>
+            </w:r>
+            <w:r>
+              <w:rPr>
+                <w:b/>
+                <w:bCs/>
+                <w:sz w:val="36"/>
+                <w:szCs w:val="36"/>
+              </w:rPr>
+              <w:t>POST</w:t>
+            </w:r>
+            <w:r>
+              <w:rPr>
+                <w:sz w:val="36"/>
+                <w:szCs w:val="36"/>
+              </w:rPr>
+              <w:t xml:space="preserve"> twice, we </w:t>
+            </w:r>
+            <w:r>
+              <w:rPr>
+                <w:sz w:val="36"/>
+                <w:szCs w:val="36"/>
+              </w:rPr>
+              <w:lastRenderedPageBreak/>
+              <w:t>might create duplicate records</w:t>
             </w:r>
           </w:p>
         </w:tc>
@@ -3130,6 +3194,7 @@
                 <w:sz w:val="36"/>
                 <w:szCs w:val="36"/>
               </w:rPr>
+              <w:lastRenderedPageBreak/>
               <w:t>PUT</w:t>
             </w:r>
           </w:p>
@@ -3160,7 +3225,7 @@
         </w:tc>
         <w:tc>
           <w:tcPr>
-            <w:tcW w:w="0" w:type="auto"/>
+            <w:tcW w:w="4331" w:type="dxa"/>
             <w:hideMark/>
           </w:tcPr>
           <w:p>
@@ -3179,6 +3244,43 @@
                 <w:szCs w:val="36"/>
               </w:rPr>
               <w:t>Edit a post</w:t>
+            </w:r>
+            <w:r>
+              <w:rPr>
+                <w:sz w:val="36"/>
+                <w:szCs w:val="36"/>
+              </w:rPr>
+              <w:t>.</w:t>
+            </w:r>
+            <w:r>
+              <w:rPr>
+                <w:sz w:val="36"/>
+                <w:szCs w:val="36"/>
+              </w:rPr>
+              <w:t xml:space="preserve"> </w:t>
+            </w:r>
+            <w:r>
+              <w:rPr>
+                <w:sz w:val="36"/>
+                <w:szCs w:val="36"/>
+              </w:rPr>
+              <w:t xml:space="preserve">It’s idempotent, sending the same </w:t>
+            </w:r>
+            <w:r>
+              <w:rPr>
+                <w:b/>
+                <w:bCs/>
+                <w:sz w:val="36"/>
+                <w:szCs w:val="36"/>
+              </w:rPr>
+              <w:t>PUT</w:t>
+            </w:r>
+            <w:r>
+              <w:rPr>
+                <w:sz w:val="36"/>
+                <w:szCs w:val="36"/>
+              </w:rPr>
+              <w:t xml:space="preserve"> multiple times gives the same result</w:t>
             </w:r>
           </w:p>
         </w:tc>
@@ -3234,7 +3336,7 @@
         </w:tc>
         <w:tc>
           <w:tcPr>
-            <w:tcW w:w="0" w:type="auto"/>
+            <w:tcW w:w="4331" w:type="dxa"/>
             <w:hideMark/>
           </w:tcPr>
           <w:p>
@@ -3254,6 +3356,237 @@
               </w:rPr>
               <w:t>Remove a post</w:t>
             </w:r>
+            <w:r>
+              <w:rPr>
+                <w:sz w:val="36"/>
+                <w:szCs w:val="36"/>
+              </w:rPr>
+              <w:t>.</w:t>
+            </w:r>
+          </w:p>
+        </w:tc>
+      </w:tr>
+      <w:tr>
+        <w:trPr>
+          <w:cnfStyle w:val="000000100000" w:firstRow="0" w:lastRow="0" w:firstColumn="0" w:lastColumn="0" w:oddVBand="0" w:evenVBand="0" w:oddHBand="1" w:evenHBand="0" w:firstRowFirstColumn="0" w:firstRowLastColumn="0" w:lastRowFirstColumn="0" w:lastRowLastColumn="0"/>
+        </w:trPr>
+        <w:tc>
+          <w:tcPr>
+            <w:cnfStyle w:val="001000000000" w:firstRow="0" w:lastRow="0" w:firstColumn="1" w:lastColumn="0" w:oddVBand="0" w:evenVBand="0" w:oddHBand="0" w:evenHBand="0" w:firstRowFirstColumn="0" w:firstRowLastColumn="0" w:lastRowFirstColumn="0" w:lastRowLastColumn="0"/>
+            <w:tcW w:w="0" w:type="auto"/>
+          </w:tcPr>
+          <w:p>
+            <w:pPr>
+              <w:jc w:val="center"/>
+              <w:rPr>
+                <w:sz w:val="36"/>
+                <w:szCs w:val="36"/>
+              </w:rPr>
+            </w:pPr>
+            <w:r>
+              <w:rPr>
+                <w:sz w:val="36"/>
+                <w:szCs w:val="36"/>
+              </w:rPr>
+              <w:t>Patch</w:t>
+            </w:r>
+          </w:p>
+        </w:tc>
+        <w:tc>
+          <w:tcPr>
+            <w:tcW w:w="0" w:type="auto"/>
+          </w:tcPr>
+          <w:p>
+            <w:pPr>
+              <w:jc w:val="both"/>
+              <w:cnfStyle w:val="000000100000" w:firstRow="0" w:lastRow="0" w:firstColumn="0" w:lastColumn="0" w:oddVBand="0" w:evenVBand="0" w:oddHBand="1" w:evenHBand="0" w:firstRowFirstColumn="0" w:firstRowLastColumn="0" w:lastRowFirstColumn="0" w:lastRowLastColumn="0"/>
+              <w:rPr>
+                <w:sz w:val="36"/>
+                <w:szCs w:val="36"/>
+              </w:rPr>
+            </w:pPr>
+            <w:r>
+              <w:rPr>
+                <w:sz w:val="36"/>
+                <w:szCs w:val="36"/>
+              </w:rPr>
+              <w:t>Smart Update</w:t>
+            </w:r>
+          </w:p>
+        </w:tc>
+        <w:tc>
+          <w:tcPr>
+            <w:tcW w:w="4331" w:type="dxa"/>
+          </w:tcPr>
+          <w:p>
+            <w:pPr>
+              <w:jc w:val="both"/>
+              <w:cnfStyle w:val="000000100000" w:firstRow="0" w:lastRow="0" w:firstColumn="0" w:lastColumn="0" w:oddVBand="0" w:evenVBand="0" w:oddHBand="1" w:evenHBand="0" w:firstRowFirstColumn="0" w:firstRowLastColumn="0" w:lastRowFirstColumn="0" w:lastRowLastColumn="0"/>
+              <w:rPr>
+                <w:sz w:val="36"/>
+                <w:szCs w:val="36"/>
+              </w:rPr>
+            </w:pPr>
+            <w:r>
+              <w:rPr>
+                <w:sz w:val="36"/>
+                <w:szCs w:val="36"/>
+              </w:rPr>
+              <w:t>Instead of replacing all packages it only updates the part needs to change. Like updating the users name but keeping age and email the same</w:t>
+            </w:r>
+          </w:p>
+        </w:tc>
+      </w:tr>
+      <w:tr>
+        <w:tc>
+          <w:tcPr>
+            <w:cnfStyle w:val="001000000000" w:firstRow="0" w:lastRow="0" w:firstColumn="1" w:lastColumn="0" w:oddVBand="0" w:evenVBand="0" w:oddHBand="0" w:evenHBand="0" w:firstRowFirstColumn="0" w:firstRowLastColumn="0" w:lastRowFirstColumn="0" w:lastRowLastColumn="0"/>
+            <w:tcW w:w="0" w:type="auto"/>
+          </w:tcPr>
+          <w:p>
+            <w:pPr>
+              <w:jc w:val="center"/>
+              <w:rPr>
+                <w:sz w:val="36"/>
+                <w:szCs w:val="36"/>
+              </w:rPr>
+            </w:pPr>
+            <w:r>
+              <w:rPr>
+                <w:sz w:val="36"/>
+                <w:szCs w:val="36"/>
+              </w:rPr>
+              <w:t>HEAD</w:t>
+            </w:r>
+          </w:p>
+        </w:tc>
+        <w:tc>
+          <w:tcPr>
+            <w:tcW w:w="0" w:type="auto"/>
+          </w:tcPr>
+          <w:p>
+            <w:pPr>
+              <w:jc w:val="both"/>
+              <w:cnfStyle w:val="000000000000" w:firstRow="0" w:lastRow="0" w:firstColumn="0" w:lastColumn="0" w:oddVBand="0" w:evenVBand="0" w:oddHBand="0" w:evenHBand="0" w:firstRowFirstColumn="0" w:firstRowLastColumn="0" w:lastRowFirstColumn="0" w:lastRowLastColumn="0"/>
+              <w:rPr>
+                <w:sz w:val="36"/>
+                <w:szCs w:val="36"/>
+              </w:rPr>
+            </w:pPr>
+            <w:r>
+              <w:rPr>
+                <w:sz w:val="36"/>
+                <w:szCs w:val="36"/>
+              </w:rPr>
+              <w:t>Read Headers</w:t>
+            </w:r>
+          </w:p>
+        </w:tc>
+        <w:tc>
+          <w:tcPr>
+            <w:tcW w:w="4331" w:type="dxa"/>
+          </w:tcPr>
+          <w:p>
+            <w:pPr>
+              <w:jc w:val="both"/>
+              <w:cnfStyle w:val="000000000000" w:firstRow="0" w:lastRow="0" w:firstColumn="0" w:lastColumn="0" w:oddVBand="0" w:evenVBand="0" w:oddHBand="0" w:evenHBand="0" w:firstRowFirstColumn="0" w:firstRowLastColumn="0" w:lastRowFirstColumn="0" w:lastRowLastColumn="0"/>
+              <w:rPr>
+                <w:sz w:val="36"/>
+                <w:szCs w:val="36"/>
+              </w:rPr>
+            </w:pPr>
+            <w:r>
+              <w:rPr>
+                <w:sz w:val="36"/>
+                <w:szCs w:val="36"/>
+              </w:rPr>
+              <w:t>It only fetches the headers not the body. Getting information like file size and type. Useful for double checking before getting the content</w:t>
+            </w:r>
+          </w:p>
+        </w:tc>
+      </w:tr>
+      <w:tr>
+        <w:trPr>
+          <w:cnfStyle w:val="000000100000" w:firstRow="0" w:lastRow="0" w:firstColumn="0" w:lastColumn="0" w:oddVBand="0" w:evenVBand="0" w:oddHBand="1" w:evenHBand="0" w:firstRowFirstColumn="0" w:firstRowLastColumn="0" w:lastRowFirstColumn="0" w:lastRowLastColumn="0"/>
+        </w:trPr>
+        <w:tc>
+          <w:tcPr>
+            <w:cnfStyle w:val="001000000000" w:firstRow="0" w:lastRow="0" w:firstColumn="1" w:lastColumn="0" w:oddVBand="0" w:evenVBand="0" w:oddHBand="0" w:evenHBand="0" w:firstRowFirstColumn="0" w:firstRowLastColumn="0" w:lastRowFirstColumn="0" w:lastRowLastColumn="0"/>
+            <w:tcW w:w="0" w:type="auto"/>
+          </w:tcPr>
+          <w:p>
+            <w:pPr>
+              <w:jc w:val="center"/>
+              <w:rPr>
+                <w:sz w:val="36"/>
+                <w:szCs w:val="36"/>
+              </w:rPr>
+            </w:pPr>
+            <w:r>
+              <w:rPr>
+                <w:sz w:val="36"/>
+                <w:szCs w:val="36"/>
+              </w:rPr>
+              <w:t>OPTIONS</w:t>
+            </w:r>
+          </w:p>
+        </w:tc>
+        <w:tc>
+          <w:tcPr>
+            <w:tcW w:w="0" w:type="auto"/>
+          </w:tcPr>
+          <w:p>
+            <w:pPr>
+              <w:jc w:val="both"/>
+              <w:cnfStyle w:val="000000100000" w:firstRow="0" w:lastRow="0" w:firstColumn="0" w:lastColumn="0" w:oddVBand="0" w:evenVBand="0" w:oddHBand="1" w:evenHBand="0" w:firstRowFirstColumn="0" w:firstRowLastColumn="0" w:lastRowFirstColumn="0" w:lastRowLastColumn="0"/>
+              <w:rPr>
+                <w:sz w:val="36"/>
+                <w:szCs w:val="36"/>
+              </w:rPr>
+            </w:pPr>
+            <w:r>
+              <w:rPr>
+                <w:sz w:val="36"/>
+                <w:szCs w:val="36"/>
+              </w:rPr>
+              <w:t>Checking</w:t>
+            </w:r>
+            <w:r>
+              <w:rPr>
+                <w:sz w:val="36"/>
+                <w:szCs w:val="36"/>
+              </w:rPr>
+              <w:t xml:space="preserve"> </w:t>
+            </w:r>
+            <w:r>
+              <w:rPr>
+                <w:sz w:val="36"/>
+                <w:szCs w:val="36"/>
+              </w:rPr>
+              <w:t>Permissions</w:t>
+            </w:r>
+          </w:p>
+        </w:tc>
+        <w:tc>
+          <w:tcPr>
+            <w:tcW w:w="4331" w:type="dxa"/>
+          </w:tcPr>
+          <w:p>
+            <w:pPr>
+              <w:jc w:val="both"/>
+              <w:cnfStyle w:val="000000100000" w:firstRow="0" w:lastRow="0" w:firstColumn="0" w:lastColumn="0" w:oddVBand="0" w:evenVBand="0" w:oddHBand="1" w:evenHBand="0" w:firstRowFirstColumn="0" w:firstRowLastColumn="0" w:lastRowFirstColumn="0" w:lastRowLastColumn="0"/>
+              <w:rPr>
+                <w:sz w:val="36"/>
+                <w:szCs w:val="36"/>
+              </w:rPr>
+            </w:pPr>
+            <w:r>
+              <w:rPr>
+                <w:sz w:val="36"/>
+                <w:szCs w:val="36"/>
+              </w:rPr>
+              <w:t>Returns the list of allowed HTTP methods (GET, POST…). Browser uses this to check if it’s allowed to talk to a server before sending data.</w:t>
+            </w:r>
           </w:p>
         </w:tc>
       </w:tr>
@@ -3280,51 +3613,51 @@
           <w:sz w:val="36"/>
           <w:szCs w:val="36"/>
         </w:rPr>
+        <w:t># Example POST request.</w:t>
+      </w:r>
+    </w:p>
+    <w:p>
+      <w:pPr>
+        <w:jc w:val="both"/>
+        <w:rPr>
+          <w:b/>
+          <w:bCs/>
+          <w:color w:val="D86DCB" w:themeColor="accent5" w:themeTint="99"/>
+          <w:sz w:val="36"/>
+          <w:szCs w:val="36"/>
+        </w:rPr>
+      </w:pPr>
+      <w:r>
+        <w:rPr>
+          <w:b/>
+          <w:bCs/>
+          <w:color w:val="D86DCB" w:themeColor="accent5" w:themeTint="99"/>
+          <w:sz w:val="36"/>
+          <w:szCs w:val="36"/>
+        </w:rPr>
+        <w:t>…</w:t>
+      </w:r>
+    </w:p>
+    <w:p>
+      <w:pPr>
+        <w:jc w:val="both"/>
+        <w:rPr>
+          <w:b/>
+          <w:bCs/>
+          <w:color w:val="D86DCB" w:themeColor="accent5" w:themeTint="99"/>
+          <w:sz w:val="36"/>
+          <w:szCs w:val="36"/>
+        </w:rPr>
+      </w:pPr>
+      <w:r>
+        <w:rPr>
+          <w:b/>
+          <w:bCs/>
+          <w:color w:val="D86DCB" w:themeColor="accent5" w:themeTint="99"/>
+          <w:sz w:val="36"/>
+          <w:szCs w:val="36"/>
+        </w:rPr>
         <w:lastRenderedPageBreak/>
-        <w:t># Example POST request.</w:t>
-      </w:r>
-    </w:p>
-    <w:p>
-      <w:pPr>
-        <w:jc w:val="both"/>
-        <w:rPr>
-          <w:b/>
-          <w:bCs/>
-          <w:color w:val="D86DCB" w:themeColor="accent5" w:themeTint="99"/>
-          <w:sz w:val="36"/>
-          <w:szCs w:val="36"/>
-        </w:rPr>
-      </w:pPr>
-      <w:r>
-        <w:rPr>
-          <w:b/>
-          <w:bCs/>
-          <w:color w:val="D86DCB" w:themeColor="accent5" w:themeTint="99"/>
-          <w:sz w:val="36"/>
-          <w:szCs w:val="36"/>
-        </w:rPr>
-        <w:t>…</w:t>
-      </w:r>
-    </w:p>
-    <w:p>
-      <w:pPr>
-        <w:jc w:val="both"/>
-        <w:rPr>
-          <w:b/>
-          <w:bCs/>
-          <w:color w:val="D86DCB" w:themeColor="accent5" w:themeTint="99"/>
-          <w:sz w:val="36"/>
-          <w:szCs w:val="36"/>
-        </w:rPr>
-      </w:pPr>
-      <w:r>
-        <w:rPr>
-          <w:b/>
-          <w:bCs/>
-          <w:color w:val="D86DCB" w:themeColor="accent5" w:themeTint="99"/>
-          <w:sz w:val="36"/>
-          <w:szCs w:val="36"/>
-        </w:rPr>
         <w:t xml:space="preserve">final response = await </w:t>
       </w:r>
       <w:proofErr w:type="spellStart"/>
@@ -3867,7 +4200,6 @@
           <w:sz w:val="36"/>
           <w:szCs w:val="36"/>
         </w:rPr>
-        <w:lastRenderedPageBreak/>
         <w:t>'/posts'</w:t>
       </w:r>
       <w:r>
@@ -3969,6 +4301,7 @@
           <w:sz w:val="36"/>
           <w:szCs w:val="36"/>
         </w:rPr>
+        <w:lastRenderedPageBreak/>
         <w:t xml:space="preserve">final </w:t>
       </w:r>
       <w:proofErr w:type="spellStart"/>
@@ -4493,30 +4826,118 @@
           <w:sz w:val="36"/>
           <w:szCs w:val="36"/>
         </w:rPr>
+        <w:t xml:space="preserve">  print('Success!');</w:t>
+      </w:r>
+    </w:p>
+    <w:p>
+      <w:pPr>
+        <w:jc w:val="both"/>
+        <w:rPr>
+          <w:b/>
+          <w:bCs/>
+          <w:color w:val="D86DCB" w:themeColor="accent5" w:themeTint="99"/>
+          <w:sz w:val="36"/>
+          <w:szCs w:val="36"/>
+        </w:rPr>
+      </w:pPr>
+      <w:r>
+        <w:rPr>
+          <w:b/>
+          <w:bCs/>
+          <w:color w:val="D86DCB" w:themeColor="accent5" w:themeTint="99"/>
+          <w:sz w:val="36"/>
+          <w:szCs w:val="36"/>
+        </w:rPr>
+        <w:t>} else if (</w:t>
+      </w:r>
+      <w:proofErr w:type="spellStart"/>
+      <w:r>
+        <w:rPr>
+          <w:b/>
+          <w:bCs/>
+          <w:color w:val="D86DCB" w:themeColor="accent5" w:themeTint="99"/>
+          <w:sz w:val="36"/>
+          <w:szCs w:val="36"/>
+        </w:rPr>
+        <w:t>response.statusCode</w:t>
+      </w:r>
+      <w:proofErr w:type="spellEnd"/>
+      <w:r>
+        <w:rPr>
+          <w:b/>
+          <w:bCs/>
+          <w:color w:val="D86DCB" w:themeColor="accent5" w:themeTint="99"/>
+          <w:sz w:val="36"/>
+          <w:szCs w:val="36"/>
+        </w:rPr>
+        <w:t xml:space="preserve"> == 404) {</w:t>
+      </w:r>
+    </w:p>
+    <w:p>
+      <w:pPr>
+        <w:jc w:val="both"/>
+        <w:rPr>
+          <w:b/>
+          <w:bCs/>
+          <w:color w:val="D86DCB" w:themeColor="accent5" w:themeTint="99"/>
+          <w:sz w:val="36"/>
+          <w:szCs w:val="36"/>
+        </w:rPr>
+      </w:pPr>
+      <w:r>
+        <w:rPr>
+          <w:b/>
+          <w:bCs/>
+          <w:color w:val="D86DCB" w:themeColor="accent5" w:themeTint="99"/>
+          <w:sz w:val="36"/>
+          <w:szCs w:val="36"/>
+        </w:rPr>
+        <w:t xml:space="preserve">  print('Resource not found.');</w:t>
+      </w:r>
+    </w:p>
+    <w:p>
+      <w:pPr>
+        <w:jc w:val="both"/>
+        <w:rPr>
+          <w:b/>
+          <w:bCs/>
+          <w:color w:val="D86DCB" w:themeColor="accent5" w:themeTint="99"/>
+          <w:sz w:val="36"/>
+          <w:szCs w:val="36"/>
+        </w:rPr>
+      </w:pPr>
+      <w:r>
+        <w:rPr>
+          <w:b/>
+          <w:bCs/>
+          <w:color w:val="D86DCB" w:themeColor="accent5" w:themeTint="99"/>
+          <w:sz w:val="36"/>
+          <w:szCs w:val="36"/>
+        </w:rPr>
         <w:lastRenderedPageBreak/>
-        <w:t xml:space="preserve">  print('Success!');</w:t>
-      </w:r>
-    </w:p>
-    <w:p>
-      <w:pPr>
-        <w:jc w:val="both"/>
-        <w:rPr>
-          <w:b/>
-          <w:bCs/>
-          <w:color w:val="D86DCB" w:themeColor="accent5" w:themeTint="99"/>
-          <w:sz w:val="36"/>
-          <w:szCs w:val="36"/>
-        </w:rPr>
-      </w:pPr>
-      <w:r>
-        <w:rPr>
-          <w:b/>
-          <w:bCs/>
-          <w:color w:val="D86DCB" w:themeColor="accent5" w:themeTint="99"/>
-          <w:sz w:val="36"/>
-          <w:szCs w:val="36"/>
-        </w:rPr>
-        <w:t>} else if (</w:t>
+        <w:t>} else {</w:t>
+      </w:r>
+    </w:p>
+    <w:p>
+      <w:pPr>
+        <w:jc w:val="both"/>
+        <w:rPr>
+          <w:b/>
+          <w:bCs/>
+          <w:color w:val="D86DCB" w:themeColor="accent5" w:themeTint="99"/>
+          <w:sz w:val="36"/>
+          <w:szCs w:val="36"/>
+        </w:rPr>
+      </w:pPr>
+      <w:r>
+        <w:rPr>
+          <w:b/>
+          <w:bCs/>
+          <w:color w:val="D86DCB" w:themeColor="accent5" w:themeTint="99"/>
+          <w:sz w:val="36"/>
+          <w:szCs w:val="36"/>
+        </w:rPr>
+        <w:t xml:space="preserve">  print('Server error: ${</w:t>
       </w:r>
       <w:proofErr w:type="spellStart"/>
       <w:r>
@@ -4538,94 +4959,6 @@
           <w:sz w:val="36"/>
           <w:szCs w:val="36"/>
         </w:rPr>
-        <w:t xml:space="preserve"> == 404) {</w:t>
-      </w:r>
-    </w:p>
-    <w:p>
-      <w:pPr>
-        <w:jc w:val="both"/>
-        <w:rPr>
-          <w:b/>
-          <w:bCs/>
-          <w:color w:val="D86DCB" w:themeColor="accent5" w:themeTint="99"/>
-          <w:sz w:val="36"/>
-          <w:szCs w:val="36"/>
-        </w:rPr>
-      </w:pPr>
-      <w:r>
-        <w:rPr>
-          <w:b/>
-          <w:bCs/>
-          <w:color w:val="D86DCB" w:themeColor="accent5" w:themeTint="99"/>
-          <w:sz w:val="36"/>
-          <w:szCs w:val="36"/>
-        </w:rPr>
-        <w:t xml:space="preserve">  print('Resource not found.');</w:t>
-      </w:r>
-    </w:p>
-    <w:p>
-      <w:pPr>
-        <w:jc w:val="both"/>
-        <w:rPr>
-          <w:b/>
-          <w:bCs/>
-          <w:color w:val="D86DCB" w:themeColor="accent5" w:themeTint="99"/>
-          <w:sz w:val="36"/>
-          <w:szCs w:val="36"/>
-        </w:rPr>
-      </w:pPr>
-      <w:r>
-        <w:rPr>
-          <w:b/>
-          <w:bCs/>
-          <w:color w:val="D86DCB" w:themeColor="accent5" w:themeTint="99"/>
-          <w:sz w:val="36"/>
-          <w:szCs w:val="36"/>
-        </w:rPr>
-        <w:t>} else {</w:t>
-      </w:r>
-    </w:p>
-    <w:p>
-      <w:pPr>
-        <w:jc w:val="both"/>
-        <w:rPr>
-          <w:b/>
-          <w:bCs/>
-          <w:color w:val="D86DCB" w:themeColor="accent5" w:themeTint="99"/>
-          <w:sz w:val="36"/>
-          <w:szCs w:val="36"/>
-        </w:rPr>
-      </w:pPr>
-      <w:r>
-        <w:rPr>
-          <w:b/>
-          <w:bCs/>
-          <w:color w:val="D86DCB" w:themeColor="accent5" w:themeTint="99"/>
-          <w:sz w:val="36"/>
-          <w:szCs w:val="36"/>
-        </w:rPr>
-        <w:t xml:space="preserve">  print('Server error: ${</w:t>
-      </w:r>
-      <w:proofErr w:type="spellStart"/>
-      <w:r>
-        <w:rPr>
-          <w:b/>
-          <w:bCs/>
-          <w:color w:val="D86DCB" w:themeColor="accent5" w:themeTint="99"/>
-          <w:sz w:val="36"/>
-          <w:szCs w:val="36"/>
-        </w:rPr>
-        <w:t>response.statusCode</w:t>
-      </w:r>
-      <w:proofErr w:type="spellEnd"/>
-      <w:r>
-        <w:rPr>
-          <w:b/>
-          <w:bCs/>
-          <w:color w:val="D86DCB" w:themeColor="accent5" w:themeTint="99"/>
-          <w:sz w:val="36"/>
-          <w:szCs w:val="36"/>
-        </w:rPr>
         <w:t>}');</w:t>
       </w:r>
     </w:p>
@@ -5025,58 +5358,58 @@
           <w:sz w:val="36"/>
           <w:szCs w:val="36"/>
         </w:rPr>
+        <w:t xml:space="preserve">  },</w:t>
+      </w:r>
+    </w:p>
+    <w:p>
+      <w:pPr>
+        <w:jc w:val="both"/>
+        <w:rPr>
+          <w:b/>
+          <w:bCs/>
+          <w:color w:val="D86DCB" w:themeColor="accent5" w:themeTint="99"/>
+          <w:sz w:val="36"/>
+          <w:szCs w:val="36"/>
+        </w:rPr>
+      </w:pPr>
+      <w:r>
+        <w:rPr>
+          <w:b/>
+          <w:bCs/>
+          <w:color w:val="D86DCB" w:themeColor="accent5" w:themeTint="99"/>
+          <w:sz w:val="36"/>
+          <w:szCs w:val="36"/>
+        </w:rPr>
+        <w:t>);</w:t>
+      </w:r>
+    </w:p>
+    <w:p>
+      <w:pPr>
+        <w:jc w:val="both"/>
+        <w:rPr>
+          <w:sz w:val="36"/>
+          <w:szCs w:val="36"/>
+        </w:rPr>
+      </w:pPr>
+    </w:p>
+    <w:p>
+      <w:pPr>
+        <w:jc w:val="both"/>
+        <w:rPr>
+          <w:b/>
+          <w:bCs/>
+          <w:sz w:val="36"/>
+          <w:szCs w:val="36"/>
+        </w:rPr>
+      </w:pPr>
+      <w:r>
+        <w:rPr>
+          <w:b/>
+          <w:bCs/>
+          <w:sz w:val="36"/>
+          <w:szCs w:val="36"/>
+        </w:rPr>
         <w:lastRenderedPageBreak/>
-        <w:t xml:space="preserve">  },</w:t>
-      </w:r>
-    </w:p>
-    <w:p>
-      <w:pPr>
-        <w:jc w:val="both"/>
-        <w:rPr>
-          <w:b/>
-          <w:bCs/>
-          <w:color w:val="D86DCB" w:themeColor="accent5" w:themeTint="99"/>
-          <w:sz w:val="36"/>
-          <w:szCs w:val="36"/>
-        </w:rPr>
-      </w:pPr>
-      <w:r>
-        <w:rPr>
-          <w:b/>
-          <w:bCs/>
-          <w:color w:val="D86DCB" w:themeColor="accent5" w:themeTint="99"/>
-          <w:sz w:val="36"/>
-          <w:szCs w:val="36"/>
-        </w:rPr>
-        <w:t>);</w:t>
-      </w:r>
-    </w:p>
-    <w:p>
-      <w:pPr>
-        <w:jc w:val="both"/>
-        <w:rPr>
-          <w:sz w:val="36"/>
-          <w:szCs w:val="36"/>
-        </w:rPr>
-      </w:pPr>
-    </w:p>
-    <w:p>
-      <w:pPr>
-        <w:jc w:val="both"/>
-        <w:rPr>
-          <w:b/>
-          <w:bCs/>
-          <w:sz w:val="36"/>
-          <w:szCs w:val="36"/>
-        </w:rPr>
-      </w:pPr>
-      <w:r>
-        <w:rPr>
-          <w:b/>
-          <w:bCs/>
-          <w:sz w:val="36"/>
-          <w:szCs w:val="36"/>
-        </w:rPr>
         <w:t>Handling Content-Type and JSON Errors:</w:t>
       </w:r>
     </w:p>
@@ -5585,7 +5918,6 @@
           <w:sz w:val="36"/>
           <w:szCs w:val="36"/>
         </w:rPr>
-        <w:lastRenderedPageBreak/>
         <w:t xml:space="preserve">Add it to the Authorization header → Basic </w:t>
       </w:r>
       <w:proofErr w:type="spellStart"/>
@@ -5639,6 +5971,7 @@
           <w:sz w:val="36"/>
           <w:szCs w:val="36"/>
         </w:rPr>
+        <w:lastRenderedPageBreak/>
         <w:t>#</w:t>
       </w:r>
       <w:r>
@@ -6241,7 +6574,6 @@
           <w:sz w:val="36"/>
           <w:szCs w:val="36"/>
         </w:rPr>
-        <w:lastRenderedPageBreak/>
         <w:t xml:space="preserve">  }</w:t>
       </w:r>
     </w:p>
@@ -6912,7 +7244,6 @@
           <w:sz w:val="36"/>
           <w:szCs w:val="36"/>
         </w:rPr>
-        <w:lastRenderedPageBreak/>
         <w:t xml:space="preserve">  </w:t>
       </w:r>
       <w:proofErr w:type="spellStart"/>
@@ -6985,6 +7316,7 @@
           <w:sz w:val="36"/>
           <w:szCs w:val="36"/>
         </w:rPr>
+        <w:lastRenderedPageBreak/>
         <w:t>);</w:t>
       </w:r>
     </w:p>
@@ -7508,108 +7840,115 @@
           <w:sz w:val="36"/>
           <w:szCs w:val="36"/>
         </w:rPr>
+        <w:t xml:space="preserve"># </w:t>
+      </w:r>
+      <w:r>
+        <w:rPr>
+          <w:sz w:val="36"/>
+          <w:szCs w:val="36"/>
+        </w:rPr>
+        <w:t xml:space="preserve">Just use the </w:t>
+      </w:r>
+      <w:proofErr w:type="spellStart"/>
+      <w:r>
+        <w:rPr>
+          <w:b/>
+          <w:bCs/>
+          <w:sz w:val="36"/>
+          <w:szCs w:val="36"/>
+        </w:rPr>
+        <w:t>Uri.https</w:t>
+      </w:r>
+      <w:proofErr w:type="spellEnd"/>
+      <w:r>
+        <w:rPr>
+          <w:b/>
+          <w:bCs/>
+          <w:sz w:val="36"/>
+          <w:szCs w:val="36"/>
+        </w:rPr>
+        <w:t>(</w:t>
+      </w:r>
+      <w:r>
+        <w:rPr>
+          <w:b/>
+          <w:bCs/>
+          <w:sz w:val="36"/>
+          <w:szCs w:val="36"/>
+        </w:rPr>
+        <w:t>‘authorization(domain</w:t>
+      </w:r>
+      <w:r>
+        <w:rPr>
+          <w:b/>
+          <w:bCs/>
+          <w:sz w:val="36"/>
+          <w:szCs w:val="36"/>
+        </w:rPr>
+        <w:t>)</w:t>
+      </w:r>
+      <w:r>
+        <w:rPr>
+          <w:b/>
+          <w:bCs/>
+          <w:sz w:val="36"/>
+          <w:szCs w:val="36"/>
+        </w:rPr>
+        <w:t>’, ‘/path’, query</w:t>
+      </w:r>
+      <w:r>
+        <w:rPr>
+          <w:b/>
+          <w:bCs/>
+          <w:sz w:val="36"/>
+          <w:szCs w:val="36"/>
+        </w:rPr>
+        <w:t>)</w:t>
+      </w:r>
+      <w:r>
+        <w:rPr>
+          <w:b/>
+          <w:bCs/>
+          <w:sz w:val="36"/>
+          <w:szCs w:val="36"/>
+        </w:rPr>
+        <w:t xml:space="preserve"> </w:t>
+      </w:r>
+      <w:r>
+        <w:rPr>
+          <w:sz w:val="36"/>
+          <w:szCs w:val="36"/>
+        </w:rPr>
+        <w:t xml:space="preserve">method to </w:t>
+      </w:r>
+      <w:r>
+        <w:rPr>
+          <w:sz w:val="36"/>
+          <w:szCs w:val="36"/>
+        </w:rPr>
+        <w:t>send a query</w:t>
+      </w:r>
+      <w:r>
+        <w:rPr>
+          <w:sz w:val="36"/>
+          <w:szCs w:val="36"/>
+        </w:rPr>
+        <w:t xml:space="preserve"> as a Map</w:t>
+      </w:r>
+      <w:r>
+        <w:rPr>
+          <w:sz w:val="36"/>
+          <w:szCs w:val="36"/>
+        </w:rPr>
+        <w:t xml:space="preserve"> for getting </w:t>
+      </w:r>
+      <w:r>
+        <w:rPr>
+          <w:sz w:val="36"/>
+          <w:szCs w:val="36"/>
+        </w:rPr>
         <w:lastRenderedPageBreak/>
-        <w:t xml:space="preserve"># </w:t>
-      </w:r>
-      <w:r>
-        <w:rPr>
-          <w:sz w:val="36"/>
-          <w:szCs w:val="36"/>
-        </w:rPr>
-        <w:t xml:space="preserve">Just use the </w:t>
-      </w:r>
-      <w:proofErr w:type="spellStart"/>
-      <w:r>
-        <w:rPr>
-          <w:b/>
-          <w:bCs/>
-          <w:sz w:val="36"/>
-          <w:szCs w:val="36"/>
-        </w:rPr>
-        <w:t>Uri.https</w:t>
-      </w:r>
-      <w:proofErr w:type="spellEnd"/>
-      <w:r>
-        <w:rPr>
-          <w:b/>
-          <w:bCs/>
-          <w:sz w:val="36"/>
-          <w:szCs w:val="36"/>
-        </w:rPr>
-        <w:t>(</w:t>
-      </w:r>
-      <w:r>
-        <w:rPr>
-          <w:b/>
-          <w:bCs/>
-          <w:sz w:val="36"/>
-          <w:szCs w:val="36"/>
-        </w:rPr>
-        <w:t>‘authorization(domain</w:t>
-      </w:r>
-      <w:r>
-        <w:rPr>
-          <w:b/>
-          <w:bCs/>
-          <w:sz w:val="36"/>
-          <w:szCs w:val="36"/>
-        </w:rPr>
-        <w:t>)</w:t>
-      </w:r>
-      <w:r>
-        <w:rPr>
-          <w:b/>
-          <w:bCs/>
-          <w:sz w:val="36"/>
-          <w:szCs w:val="36"/>
-        </w:rPr>
-        <w:t>’, ‘/path’, query</w:t>
-      </w:r>
-      <w:r>
-        <w:rPr>
-          <w:b/>
-          <w:bCs/>
-          <w:sz w:val="36"/>
-          <w:szCs w:val="36"/>
-        </w:rPr>
-        <w:t>)</w:t>
-      </w:r>
-      <w:r>
-        <w:rPr>
-          <w:b/>
-          <w:bCs/>
-          <w:sz w:val="36"/>
-          <w:szCs w:val="36"/>
-        </w:rPr>
-        <w:t xml:space="preserve"> </w:t>
-      </w:r>
-      <w:r>
-        <w:rPr>
-          <w:sz w:val="36"/>
-          <w:szCs w:val="36"/>
-        </w:rPr>
-        <w:t xml:space="preserve">method to </w:t>
-      </w:r>
-      <w:r>
-        <w:rPr>
-          <w:sz w:val="36"/>
-          <w:szCs w:val="36"/>
-        </w:rPr>
-        <w:t>send a query</w:t>
-      </w:r>
-      <w:r>
-        <w:rPr>
-          <w:sz w:val="36"/>
-          <w:szCs w:val="36"/>
-        </w:rPr>
-        <w:t xml:space="preserve"> as a Map</w:t>
-      </w:r>
-      <w:r>
-        <w:rPr>
-          <w:sz w:val="36"/>
-          <w:szCs w:val="36"/>
-        </w:rPr>
-        <w:t xml:space="preserve"> for getting response in JSON. </w:t>
+        <w:t xml:space="preserve">response in JSON. </w:t>
       </w:r>
       <w:r>
         <w:rPr>
@@ -8375,7 +8714,6 @@
           <w:sz w:val="36"/>
           <w:szCs w:val="36"/>
         </w:rPr>
-        <w:lastRenderedPageBreak/>
         <w:t xml:space="preserve">  print(u['email']);</w:t>
       </w:r>
     </w:p>
@@ -8401,6 +8739,7 @@
           <w:sz w:val="36"/>
           <w:szCs w:val="36"/>
         </w:rPr>
+        <w:lastRenderedPageBreak/>
         <w:t>}</w:t>
       </w:r>
     </w:p>
@@ -9033,7 +9372,6 @@
           <w:sz w:val="36"/>
           <w:szCs w:val="36"/>
         </w:rPr>
-        <w:lastRenderedPageBreak/>
         <w:t>}</w:t>
       </w:r>
     </w:p>
@@ -9652,7 +9990,6 @@
           <w:sz w:val="36"/>
           <w:szCs w:val="36"/>
         </w:rPr>
-        <w:lastRenderedPageBreak/>
         <w:t xml:space="preserve">    final response = await </w:t>
       </w:r>
       <w:proofErr w:type="spellStart"/>
@@ -9700,6 +10037,7 @@
           <w:sz w:val="36"/>
           <w:szCs w:val="36"/>
         </w:rPr>
+        <w:lastRenderedPageBreak/>
         <w:t xml:space="preserve">      </w:t>
       </w:r>
       <w:proofErr w:type="spellStart"/>
@@ -10311,15 +10649,7 @@
           <w:sz w:val="36"/>
           <w:szCs w:val="36"/>
         </w:rPr>
-        <w:t xml:space="preserve"> Just check the status code if rate </w:t>
-      </w:r>
-      <w:r>
-        <w:rPr>
-          <w:sz w:val="36"/>
-          <w:szCs w:val="36"/>
-        </w:rPr>
-        <w:lastRenderedPageBreak/>
-        <w:t>limit is crossed use</w:t>
+        <w:t xml:space="preserve"> Just check the status code if rate limit is crossed use</w:t>
       </w:r>
       <w:r>
         <w:rPr>
@@ -10360,6 +10690,7 @@
           <w:sz w:val="36"/>
           <w:szCs w:val="36"/>
         </w:rPr>
+        <w:lastRenderedPageBreak/>
         <w:t>import '</w:t>
       </w:r>
       <w:proofErr w:type="spellStart"/>
@@ -11062,24 +11393,69 @@
           <w:sz w:val="36"/>
           <w:szCs w:val="36"/>
         </w:rPr>
+        <w:t xml:space="preserve"># Then we’re </w:t>
+      </w:r>
+      <w:proofErr w:type="spellStart"/>
+      <w:r>
+        <w:rPr>
+          <w:sz w:val="36"/>
+          <w:szCs w:val="36"/>
+        </w:rPr>
+        <w:t>gonna</w:t>
+      </w:r>
+      <w:proofErr w:type="spellEnd"/>
+      <w:r>
+        <w:rPr>
+          <w:sz w:val="36"/>
+          <w:szCs w:val="36"/>
+        </w:rPr>
+        <w:t xml:space="preserve"> merge into one structured object like a Map </w:t>
+      </w:r>
+      <w:proofErr w:type="spellStart"/>
+      <w:r>
+        <w:rPr>
+          <w:b/>
+          <w:bCs/>
+          <w:sz w:val="36"/>
+          <w:szCs w:val="36"/>
+        </w:rPr>
+        <w:t>mergedData</w:t>
+      </w:r>
+      <w:proofErr w:type="spellEnd"/>
+      <w:r>
+        <w:rPr>
+          <w:b/>
+          <w:bCs/>
+          <w:sz w:val="36"/>
+          <w:szCs w:val="36"/>
+        </w:rPr>
+        <w:t xml:space="preserve"> </w:t>
+      </w:r>
+    </w:p>
+    <w:p>
+      <w:pPr>
+        <w:jc w:val="both"/>
+        <w:rPr>
+          <w:sz w:val="36"/>
+          <w:szCs w:val="36"/>
+        </w:rPr>
+      </w:pPr>
+      <w:r>
+        <w:rPr>
+          <w:sz w:val="36"/>
+          <w:szCs w:val="36"/>
+        </w:rPr>
         <w:lastRenderedPageBreak/>
-        <w:t xml:space="preserve"># Then we’re </w:t>
-      </w:r>
-      <w:proofErr w:type="spellStart"/>
-      <w:r>
-        <w:rPr>
-          <w:sz w:val="36"/>
-          <w:szCs w:val="36"/>
-        </w:rPr>
-        <w:t>gonna</w:t>
-      </w:r>
-      <w:proofErr w:type="spellEnd"/>
-      <w:r>
-        <w:rPr>
-          <w:sz w:val="36"/>
-          <w:szCs w:val="36"/>
-        </w:rPr>
-        <w:t xml:space="preserve"> merge into one structured object like a Map </w:t>
+        <w:t># Then the</w:t>
+      </w:r>
+      <w:r>
+        <w:rPr>
+          <w:b/>
+          <w:bCs/>
+          <w:sz w:val="36"/>
+          <w:szCs w:val="36"/>
+        </w:rPr>
+        <w:t xml:space="preserve"> </w:t>
       </w:r>
       <w:proofErr w:type="spellStart"/>
       <w:r>
@@ -11094,51 +11470,6 @@
       <w:proofErr w:type="spellEnd"/>
       <w:r>
         <w:rPr>
-          <w:b/>
-          <w:bCs/>
-          <w:sz w:val="36"/>
-          <w:szCs w:val="36"/>
-        </w:rPr>
-        <w:t xml:space="preserve"> </w:t>
-      </w:r>
-    </w:p>
-    <w:p>
-      <w:pPr>
-        <w:jc w:val="both"/>
-        <w:rPr>
-          <w:sz w:val="36"/>
-          <w:szCs w:val="36"/>
-        </w:rPr>
-      </w:pPr>
-      <w:r>
-        <w:rPr>
-          <w:sz w:val="36"/>
-          <w:szCs w:val="36"/>
-        </w:rPr>
-        <w:t># Then the</w:t>
-      </w:r>
-      <w:r>
-        <w:rPr>
-          <w:b/>
-          <w:bCs/>
-          <w:sz w:val="36"/>
-          <w:szCs w:val="36"/>
-        </w:rPr>
-        <w:t xml:space="preserve"> </w:t>
-      </w:r>
-      <w:proofErr w:type="spellStart"/>
-      <w:r>
-        <w:rPr>
-          <w:b/>
-          <w:bCs/>
-          <w:sz w:val="36"/>
-          <w:szCs w:val="36"/>
-        </w:rPr>
-        <w:t>mergedData</w:t>
-      </w:r>
-      <w:proofErr w:type="spellEnd"/>
-      <w:r>
-        <w:rPr>
           <w:sz w:val="36"/>
           <w:szCs w:val="36"/>
         </w:rPr>
@@ -11752,139 +12083,139 @@
           <w:sz w:val="36"/>
           <w:szCs w:val="36"/>
         </w:rPr>
+        <w:t xml:space="preserve">    </w:t>
+      </w:r>
+      <w:proofErr w:type="spellStart"/>
+      <w:r>
+        <w:rPr>
+          <w:b/>
+          <w:bCs/>
+          <w:color w:val="D86DCB" w:themeColor="accent5" w:themeTint="99"/>
+          <w:sz w:val="36"/>
+          <w:szCs w:val="36"/>
+        </w:rPr>
+        <w:t>http.get</w:t>
+      </w:r>
+      <w:proofErr w:type="spellEnd"/>
+      <w:r>
+        <w:rPr>
+          <w:b/>
+          <w:bCs/>
+          <w:color w:val="D86DCB" w:themeColor="accent5" w:themeTint="99"/>
+          <w:sz w:val="36"/>
+          <w:szCs w:val="36"/>
+        </w:rPr>
+        <w:t>(</w:t>
+      </w:r>
+      <w:proofErr w:type="spellStart"/>
+      <w:r>
+        <w:rPr>
+          <w:b/>
+          <w:bCs/>
+          <w:color w:val="D86DCB" w:themeColor="accent5" w:themeTint="99"/>
+          <w:sz w:val="36"/>
+          <w:szCs w:val="36"/>
+        </w:rPr>
+        <w:t>hourlyUrl</w:t>
+      </w:r>
+      <w:proofErr w:type="spellEnd"/>
+      <w:r>
+        <w:rPr>
+          <w:b/>
+          <w:bCs/>
+          <w:color w:val="D86DCB" w:themeColor="accent5" w:themeTint="99"/>
+          <w:sz w:val="36"/>
+          <w:szCs w:val="36"/>
+        </w:rPr>
+        <w:t>),</w:t>
+      </w:r>
+    </w:p>
+    <w:p>
+      <w:pPr>
+        <w:jc w:val="both"/>
+        <w:rPr>
+          <w:b/>
+          <w:bCs/>
+          <w:color w:val="D86DCB" w:themeColor="accent5" w:themeTint="99"/>
+          <w:sz w:val="36"/>
+          <w:szCs w:val="36"/>
+        </w:rPr>
+      </w:pPr>
+      <w:r>
+        <w:rPr>
+          <w:b/>
+          <w:bCs/>
+          <w:color w:val="D86DCB" w:themeColor="accent5" w:themeTint="99"/>
+          <w:sz w:val="36"/>
+          <w:szCs w:val="36"/>
+        </w:rPr>
+        <w:t xml:space="preserve">    </w:t>
+      </w:r>
+      <w:proofErr w:type="spellStart"/>
+      <w:r>
+        <w:rPr>
+          <w:b/>
+          <w:bCs/>
+          <w:color w:val="D86DCB" w:themeColor="accent5" w:themeTint="99"/>
+          <w:sz w:val="36"/>
+          <w:szCs w:val="36"/>
+        </w:rPr>
+        <w:t>http.get</w:t>
+      </w:r>
+      <w:proofErr w:type="spellEnd"/>
+      <w:r>
+        <w:rPr>
+          <w:b/>
+          <w:bCs/>
+          <w:color w:val="D86DCB" w:themeColor="accent5" w:themeTint="99"/>
+          <w:sz w:val="36"/>
+          <w:szCs w:val="36"/>
+        </w:rPr>
+        <w:t>(</w:t>
+      </w:r>
+      <w:proofErr w:type="spellStart"/>
+      <w:r>
+        <w:rPr>
+          <w:b/>
+          <w:bCs/>
+          <w:color w:val="D86DCB" w:themeColor="accent5" w:themeTint="99"/>
+          <w:sz w:val="36"/>
+          <w:szCs w:val="36"/>
+        </w:rPr>
+        <w:t>dailyUrl</w:t>
+      </w:r>
+      <w:proofErr w:type="spellEnd"/>
+      <w:r>
+        <w:rPr>
+          <w:b/>
+          <w:bCs/>
+          <w:color w:val="D86DCB" w:themeColor="accent5" w:themeTint="99"/>
+          <w:sz w:val="36"/>
+          <w:szCs w:val="36"/>
+        </w:rPr>
+        <w:t>),</w:t>
+      </w:r>
+    </w:p>
+    <w:p>
+      <w:pPr>
+        <w:jc w:val="both"/>
+        <w:rPr>
+          <w:b/>
+          <w:bCs/>
+          <w:color w:val="D86DCB" w:themeColor="accent5" w:themeTint="99"/>
+          <w:sz w:val="36"/>
+          <w:szCs w:val="36"/>
+        </w:rPr>
+      </w:pPr>
+      <w:r>
+        <w:rPr>
+          <w:b/>
+          <w:bCs/>
+          <w:color w:val="D86DCB" w:themeColor="accent5" w:themeTint="99"/>
+          <w:sz w:val="36"/>
+          <w:szCs w:val="36"/>
+        </w:rPr>
         <w:lastRenderedPageBreak/>
-        <w:t xml:space="preserve">    </w:t>
-      </w:r>
-      <w:proofErr w:type="spellStart"/>
-      <w:r>
-        <w:rPr>
-          <w:b/>
-          <w:bCs/>
-          <w:color w:val="D86DCB" w:themeColor="accent5" w:themeTint="99"/>
-          <w:sz w:val="36"/>
-          <w:szCs w:val="36"/>
-        </w:rPr>
-        <w:t>http.get</w:t>
-      </w:r>
-      <w:proofErr w:type="spellEnd"/>
-      <w:r>
-        <w:rPr>
-          <w:b/>
-          <w:bCs/>
-          <w:color w:val="D86DCB" w:themeColor="accent5" w:themeTint="99"/>
-          <w:sz w:val="36"/>
-          <w:szCs w:val="36"/>
-        </w:rPr>
-        <w:t>(</w:t>
-      </w:r>
-      <w:proofErr w:type="spellStart"/>
-      <w:r>
-        <w:rPr>
-          <w:b/>
-          <w:bCs/>
-          <w:color w:val="D86DCB" w:themeColor="accent5" w:themeTint="99"/>
-          <w:sz w:val="36"/>
-          <w:szCs w:val="36"/>
-        </w:rPr>
-        <w:t>hourlyUrl</w:t>
-      </w:r>
-      <w:proofErr w:type="spellEnd"/>
-      <w:r>
-        <w:rPr>
-          <w:b/>
-          <w:bCs/>
-          <w:color w:val="D86DCB" w:themeColor="accent5" w:themeTint="99"/>
-          <w:sz w:val="36"/>
-          <w:szCs w:val="36"/>
-        </w:rPr>
-        <w:t>),</w:t>
-      </w:r>
-    </w:p>
-    <w:p>
-      <w:pPr>
-        <w:jc w:val="both"/>
-        <w:rPr>
-          <w:b/>
-          <w:bCs/>
-          <w:color w:val="D86DCB" w:themeColor="accent5" w:themeTint="99"/>
-          <w:sz w:val="36"/>
-          <w:szCs w:val="36"/>
-        </w:rPr>
-      </w:pPr>
-      <w:r>
-        <w:rPr>
-          <w:b/>
-          <w:bCs/>
-          <w:color w:val="D86DCB" w:themeColor="accent5" w:themeTint="99"/>
-          <w:sz w:val="36"/>
-          <w:szCs w:val="36"/>
-        </w:rPr>
-        <w:t xml:space="preserve">    </w:t>
-      </w:r>
-      <w:proofErr w:type="spellStart"/>
-      <w:r>
-        <w:rPr>
-          <w:b/>
-          <w:bCs/>
-          <w:color w:val="D86DCB" w:themeColor="accent5" w:themeTint="99"/>
-          <w:sz w:val="36"/>
-          <w:szCs w:val="36"/>
-        </w:rPr>
-        <w:t>http.get</w:t>
-      </w:r>
-      <w:proofErr w:type="spellEnd"/>
-      <w:r>
-        <w:rPr>
-          <w:b/>
-          <w:bCs/>
-          <w:color w:val="D86DCB" w:themeColor="accent5" w:themeTint="99"/>
-          <w:sz w:val="36"/>
-          <w:szCs w:val="36"/>
-        </w:rPr>
-        <w:t>(</w:t>
-      </w:r>
-      <w:proofErr w:type="spellStart"/>
-      <w:r>
-        <w:rPr>
-          <w:b/>
-          <w:bCs/>
-          <w:color w:val="D86DCB" w:themeColor="accent5" w:themeTint="99"/>
-          <w:sz w:val="36"/>
-          <w:szCs w:val="36"/>
-        </w:rPr>
-        <w:t>dailyUrl</w:t>
-      </w:r>
-      <w:proofErr w:type="spellEnd"/>
-      <w:r>
-        <w:rPr>
-          <w:b/>
-          <w:bCs/>
-          <w:color w:val="D86DCB" w:themeColor="accent5" w:themeTint="99"/>
-          <w:sz w:val="36"/>
-          <w:szCs w:val="36"/>
-        </w:rPr>
-        <w:t>),</w:t>
-      </w:r>
-    </w:p>
-    <w:p>
-      <w:pPr>
-        <w:jc w:val="both"/>
-        <w:rPr>
-          <w:b/>
-          <w:bCs/>
-          <w:color w:val="D86DCB" w:themeColor="accent5" w:themeTint="99"/>
-          <w:sz w:val="36"/>
-          <w:szCs w:val="36"/>
-        </w:rPr>
-      </w:pPr>
-      <w:r>
-        <w:rPr>
-          <w:b/>
-          <w:bCs/>
-          <w:color w:val="D86DCB" w:themeColor="accent5" w:themeTint="99"/>
-          <w:sz w:val="36"/>
-          <w:szCs w:val="36"/>
-        </w:rPr>
         <w:t xml:space="preserve">  ]);</w:t>
       </w:r>
     </w:p>
@@ -12590,7 +12921,6 @@
           <w:sz w:val="36"/>
           <w:szCs w:val="36"/>
         </w:rPr>
-        <w:lastRenderedPageBreak/>
         <w:t>Note:</w:t>
       </w:r>
       <w:r>
@@ -13081,7 +13411,6 @@
           <w:sz w:val="36"/>
           <w:szCs w:val="36"/>
         </w:rPr>
-        <w:lastRenderedPageBreak/>
         <w:t>name = Nazmul</w:t>
       </w:r>
     </w:p>
@@ -13127,6 +13456,7 @@
           <w:sz w:val="36"/>
           <w:szCs w:val="36"/>
         </w:rPr>
+        <w:lastRenderedPageBreak/>
         <w:t>profile_image</w:t>
       </w:r>
       <w:proofErr w:type="spellEnd"/>
@@ -14000,7 +14330,6 @@
           <w:sz w:val="36"/>
           <w:szCs w:val="36"/>
         </w:rPr>
-        <w:lastRenderedPageBreak/>
         <w:t xml:space="preserve">  );</w:t>
       </w:r>
     </w:p>
@@ -14051,6 +14380,7 @@
           <w:sz w:val="36"/>
           <w:szCs w:val="36"/>
         </w:rPr>
+        <w:lastRenderedPageBreak/>
         <w:t>}</w:t>
       </w:r>
     </w:p>
@@ -14797,7 +15127,6 @@
           <w:sz w:val="36"/>
           <w:szCs w:val="36"/>
         </w:rPr>
-        <w:lastRenderedPageBreak/>
         <w:t xml:space="preserve">          'email': 'nhasar18@gmail.com'</w:t>
       </w:r>
     </w:p>
@@ -14848,6 +15177,7 @@
           <w:sz w:val="36"/>
           <w:szCs w:val="36"/>
         </w:rPr>
+        <w:lastRenderedPageBreak/>
         <w:t xml:space="preserve">    );</w:t>
       </w:r>
     </w:p>
@@ -15524,7 +15854,6 @@
           <w:sz w:val="36"/>
           <w:szCs w:val="36"/>
         </w:rPr>
-        <w:lastRenderedPageBreak/>
         <w:t xml:space="preserve">    </w:t>
       </w:r>
       <w:proofErr w:type="spellStart"/>
@@ -15597,6 +15926,7 @@
           <w:sz w:val="36"/>
           <w:szCs w:val="36"/>
         </w:rPr>
+        <w:lastRenderedPageBreak/>
         <w:t xml:space="preserve">  }</w:t>
       </w:r>
     </w:p>
@@ -16237,7 +16567,6 @@
           <w:sz w:val="36"/>
           <w:szCs w:val="36"/>
         </w:rPr>
-        <w:lastRenderedPageBreak/>
         <w:t xml:space="preserve">   </w:t>
       </w:r>
       <w:proofErr w:type="spellStart"/>
@@ -16400,6 +16729,7 @@
           <w:sz w:val="36"/>
           <w:szCs w:val="36"/>
         </w:rPr>
+        <w:lastRenderedPageBreak/>
         <w:t xml:space="preserve">    …</w:t>
       </w:r>
     </w:p>
@@ -17154,7 +17484,6 @@
           <w:sz w:val="36"/>
           <w:szCs w:val="36"/>
         </w:rPr>
-        <w:lastRenderedPageBreak/>
         <w:t xml:space="preserve">  </w:t>
       </w:r>
       <w:proofErr w:type="spellStart"/>
@@ -17227,6 +17556,7 @@
           <w:sz w:val="36"/>
           <w:szCs w:val="36"/>
         </w:rPr>
+        <w:lastRenderedPageBreak/>
         <w:t xml:space="preserve">  var </w:t>
       </w:r>
       <w:proofErr w:type="spellStart"/>
@@ -17996,7 +18326,6 @@
           <w:sz w:val="36"/>
           <w:szCs w:val="36"/>
         </w:rPr>
-        <w:lastRenderedPageBreak/>
         <w:t xml:space="preserve">    var request = </w:t>
       </w:r>
       <w:proofErr w:type="spellStart"/>
@@ -18071,6 +18400,7 @@
           <w:sz w:val="36"/>
           <w:szCs w:val="36"/>
         </w:rPr>
+        <w:lastRenderedPageBreak/>
         <w:t xml:space="preserve">      </w:t>
       </w:r>
       <w:proofErr w:type="spellStart"/>
@@ -18842,6 +19172,7 @@
           <w:sz w:val="36"/>
           <w:szCs w:val="36"/>
         </w:rPr>
+        <w:lastRenderedPageBreak/>
         <w:t xml:space="preserve"># 1, Add headers (auth token). </w:t>
       </w:r>
       <w:proofErr w:type="gramStart"/>
@@ -44067,37 +44398,7 @@
           <w:sz w:val="36"/>
           <w:szCs w:val="36"/>
         </w:rPr>
-        <w:t xml:space="preserve">      </w:t>
-      </w:r>
-      <w:r>
-        <w:rPr>
-          <w:b/>
-          <w:bCs/>
-          <w:color w:val="D86DCB" w:themeColor="accent5" w:themeTint="99"/>
-          <w:sz w:val="36"/>
-          <w:szCs w:val="36"/>
-        </w:rPr>
-        <w:t>F</w:t>
-      </w:r>
-      <w:r>
-        <w:rPr>
-          <w:b/>
-          <w:bCs/>
-          <w:color w:val="D86DCB" w:themeColor="accent5" w:themeTint="99"/>
-          <w:sz w:val="36"/>
-          <w:szCs w:val="36"/>
-        </w:rPr>
-        <w:t>inal</w:t>
-      </w:r>
-      <w:r>
-        <w:rPr>
-          <w:b/>
-          <w:bCs/>
-          <w:color w:val="D86DCB" w:themeColor="accent5" w:themeTint="99"/>
-          <w:sz w:val="36"/>
-          <w:szCs w:val="36"/>
-        </w:rPr>
-        <w:t xml:space="preserve"> List&lt;</w:t>
+        <w:t xml:space="preserve">      Final List&lt;</w:t>
       </w:r>
       <w:proofErr w:type="spellStart"/>
       <w:r>
@@ -44119,17 +44420,7 @@
           <w:sz w:val="36"/>
           <w:szCs w:val="36"/>
         </w:rPr>
-        <w:t>&gt;</w:t>
-      </w:r>
-      <w:r>
-        <w:rPr>
-          <w:b/>
-          <w:bCs/>
-          <w:color w:val="D86DCB" w:themeColor="accent5" w:themeTint="99"/>
-          <w:sz w:val="36"/>
-          <w:szCs w:val="36"/>
-        </w:rPr>
-        <w:t xml:space="preserve"> response = await </w:t>
+        <w:t xml:space="preserve">&gt; response = await </w:t>
       </w:r>
       <w:proofErr w:type="spellStart"/>
       <w:r>
@@ -44896,29 +45187,7 @@
           <w:sz w:val="36"/>
           <w:szCs w:val="36"/>
         </w:rPr>
-        <w:t xml:space="preserve">": </w:t>
-      </w:r>
-      <w:proofErr w:type="spellStart"/>
-      <w:r>
-        <w:rPr>
-          <w:b/>
-          <w:bCs/>
-          <w:color w:val="D86DCB" w:themeColor="accent5" w:themeTint="99"/>
-          <w:sz w:val="36"/>
-          <w:szCs w:val="36"/>
-        </w:rPr>
-        <w:t>lat</w:t>
-      </w:r>
-      <w:proofErr w:type="spellEnd"/>
-      <w:r>
-        <w:rPr>
-          <w:b/>
-          <w:bCs/>
-          <w:color w:val="D86DCB" w:themeColor="accent5" w:themeTint="99"/>
-          <w:sz w:val="36"/>
-          <w:szCs w:val="36"/>
-        </w:rPr>
-        <w:t>,</w:t>
+        <w:t>": lat,</w:t>
       </w:r>
     </w:p>
     <w:p>
@@ -44962,29 +45231,7 @@
           <w:sz w:val="36"/>
           <w:szCs w:val="36"/>
         </w:rPr>
-        <w:t xml:space="preserve">": </w:t>
-      </w:r>
-      <w:proofErr w:type="spellStart"/>
-      <w:r>
-        <w:rPr>
-          <w:b/>
-          <w:bCs/>
-          <w:color w:val="D86DCB" w:themeColor="accent5" w:themeTint="99"/>
-          <w:sz w:val="36"/>
-          <w:szCs w:val="36"/>
-        </w:rPr>
-        <w:t>lon</w:t>
-      </w:r>
-      <w:proofErr w:type="spellEnd"/>
-      <w:r>
-        <w:rPr>
-          <w:b/>
-          <w:bCs/>
-          <w:color w:val="D86DCB" w:themeColor="accent5" w:themeTint="99"/>
-          <w:sz w:val="36"/>
-          <w:szCs w:val="36"/>
-        </w:rPr>
-        <w:t>,</w:t>
+        <w:t>": lon,</w:t>
       </w:r>
     </w:p>
     <w:p>

</xml_diff>